<commit_message>
Write-up with detailed ablation appendix; docs and results tidy-up
- docs/devanshi_garg_write_up.docx: final numbers (5 pooled runs), new
  "With a month" section, appendix with every ablation table explained
- docs/devanshi_garg_write_up.md: the same, readable on GitHub
- docs/devanshi_garg_ablation_tables.pdf: full-suite ablation tables
- report.py: correct a caption that claimed the worked examples were in
  fresh wording; _orig tables rebuilt from their saved scores (no calls)
- remove an incomplete quick-suite checkpoint folder
- README says where everything is

Co-Authored-By: Claude Opus 5.5 <noreply@anthropic.com>
Claude-Session: https://claude.ai/code/session_01SvDoZtFYfQ1QRWL6xYWtTj
</commit_message>
<xml_diff>
--- a/docs/devanshi_garg_write_up.docx
+++ b/docs/devanshi_garg_write_up.docx
@@ -54,7 +54,7 @@
     </w:p>
     <w:p>
       <w:pPr>
-        <w:spacing w:after="80" w:line="240"/>
+        <w:spacing w:after="50" w:line="234"/>
       </w:pPr>
       <w:r>
         <w:rPr>
@@ -72,7 +72,7 @@
           <w:ilvl w:val="0"/>
           <w:numId w:val="2"/>
         </w:numPr>
-        <w:spacing w:after="20" w:line="240"/>
+        <w:spacing w:after="12" w:line="234"/>
       </w:pPr>
       <w:r>
         <w:rPr>
@@ -100,7 +100,7 @@
           <w:ilvl w:val="0"/>
           <w:numId w:val="2"/>
         </w:numPr>
-        <w:spacing w:after="20" w:line="240"/>
+        <w:spacing w:after="12" w:line="234"/>
       </w:pPr>
       <w:r>
         <w:rPr>
@@ -123,7 +123,7 @@
     </w:p>
     <w:p>
       <w:pPr>
-        <w:spacing w:after="80" w:line="240"/>
+        <w:spacing w:after="50" w:line="234"/>
       </w:pPr>
       <w:r>
         <w:rPr>
@@ -149,12 +149,12 @@
           <w:sz w:val="20"/>
           <w:szCs w:val="20"/>
         </w:rPr>
-        <w:t xml:space="preserve">.</w:t>
-      </w:r>
-    </w:p>
-    <w:p>
-      <w:pPr>
-        <w:spacing w:after="80" w:line="240"/>
+        <w:t xml:space="preserve"> (my own direct-answer baseline: 0.3% over 5 runs).</w:t>
+      </w:r>
+    </w:p>
+    <w:p>
+      <w:pPr>
+        <w:spacing w:after="50" w:line="234"/>
       </w:pPr>
       <w:r>
         <w:rPr>
@@ -221,7 +221,7 @@
     </w:p>
     <w:p>
       <w:pPr>
-        <w:spacing w:after="80" w:line="240"/>
+        <w:spacing w:after="50" w:line="234"/>
       </w:pPr>
       <w:r>
         <w:rPr>
@@ -256,7 +256,7 @@
           <w:ilvl w:val="0"/>
           <w:numId w:val="3"/>
         </w:numPr>
-        <w:spacing w:after="30" w:line="240"/>
+        <w:spacing w:after="15" w:line="234"/>
       </w:pPr>
       <w:r>
         <w:rPr>
@@ -293,7 +293,7 @@
           <w:ilvl w:val="0"/>
           <w:numId w:val="3"/>
         </w:numPr>
-        <w:spacing w:after="30" w:line="240"/>
+        <w:spacing w:after="15" w:line="234"/>
       </w:pPr>
       <w:r>
         <w:rPr>
@@ -330,7 +330,7 @@
           <w:ilvl w:val="0"/>
           <w:numId w:val="3"/>
         </w:numPr>
-        <w:spacing w:after="30" w:line="240"/>
+        <w:spacing w:after="15" w:line="234"/>
       </w:pPr>
       <w:r>
         <w:rPr>
@@ -370,7 +370,7 @@
     </w:p>
     <w:p>
       <w:pPr>
-        <w:spacing w:after="80" w:line="240"/>
+        <w:spacing w:after="50" w:line="234"/>
       </w:pPr>
       <w:r>
         <w:rPr>
@@ -529,25 +529,25 @@
     </w:p>
     <w:p>
       <w:pPr>
-        <w:spacing w:after="80" w:line="240"/>
-      </w:pPr>
-      <w:r>
-        <w:rPr>
-          <w:rFonts w:ascii="Calibri" w:cs="Calibri" w:eastAsia="Calibri" w:hAnsi="Calibri"/>
-          <w:sz w:val="20"/>
-          <w:szCs w:val="20"/>
-        </w:rPr>
-        <w:t xml:space="preserve">I built a reference set with the correct fact for every line of the 60 items (drafted with Claude, verified by running the solver on it against the answer key: 100%), then compared Granite's output line by line instead of only looking at the final score.</w:t>
-      </w:r>
-    </w:p>
-    <w:p>
-      <w:pPr>
-        <w:pStyle w:val="ListParagraph"/>
-        <w:numPr>
-          <w:ilvl w:val="0"/>
-          <w:numId w:val="3"/>
-        </w:numPr>
-        <w:spacing w:after="30" w:line="240"/>
+        <w:spacing w:after="50" w:line="234"/>
+      </w:pPr>
+      <w:r>
+        <w:rPr>
+          <w:rFonts w:ascii="Calibri" w:cs="Calibri" w:eastAsia="Calibri" w:hAnsi="Calibri"/>
+          <w:sz w:val="20"/>
+          <w:szCs w:val="20"/>
+        </w:rPr>
+        <w:t xml:space="preserve">I built a reference set with the correct fact for every line of the 60 items (drafted with Claude; the solver scores 100% on it), then compared Granite's output line by line instead of only looking at the final score.</w:t>
+      </w:r>
+    </w:p>
+    <w:p>
+      <w:pPr>
+        <w:pStyle w:val="ListParagraph"/>
+        <w:numPr>
+          <w:ilvl w:val="0"/>
+          <w:numId w:val="3"/>
+        </w:numPr>
+        <w:spacing w:after="15" w:line="234"/>
       </w:pPr>
       <w:r>
         <w:rPr>
@@ -592,7 +592,7 @@
           <w:ilvl w:val="0"/>
           <w:numId w:val="3"/>
         </w:numPr>
-        <w:spacing w:after="30" w:line="240"/>
+        <w:spacing w:after="15" w:line="234"/>
       </w:pPr>
       <w:r>
         <w:rPr>
@@ -637,7 +637,7 @@
           <w:ilvl w:val="0"/>
           <w:numId w:val="3"/>
         </w:numPr>
-        <w:spacing w:after="30" w:line="240"/>
+        <w:spacing w:after="15" w:line="234"/>
       </w:pPr>
       <w:r>
         <w:rPr>
@@ -717,7 +717,7 @@
           <w:ilvl w:val="0"/>
           <w:numId w:val="3"/>
         </w:numPr>
-        <w:spacing w:after="30" w:line="240"/>
+        <w:spacing w:after="15" w:line="234"/>
       </w:pPr>
       <w:r>
         <w:rPr>
@@ -745,7 +745,7 @@
           <w:ilvl w:val="0"/>
           <w:numId w:val="3"/>
         </w:numPr>
-        <w:spacing w:after="30" w:line="240"/>
+        <w:spacing w:after="15" w:line="234"/>
       </w:pPr>
       <w:r>
         <w:rPr>
@@ -764,34 +764,6 @@
           <w:szCs w:val="20"/>
         </w:rPr>
         <w:t xml:space="preserve"> A second read with the same prompt disagreed with only 35% of the first read's errors; a differently formatted prompt disagreed with 59%. This one fact shaped the whole 3×/10× design.</w:t>
-      </w:r>
-    </w:p>
-    <w:p>
-      <w:pPr>
-        <w:pStyle w:val="ListParagraph"/>
-        <w:numPr>
-          <w:ilvl w:val="0"/>
-          <w:numId w:val="3"/>
-        </w:numPr>
-        <w:spacing w:after="30" w:line="240"/>
-      </w:pPr>
-      <w:r>
-        <w:rPr>
-          <w:rFonts w:ascii="Calibri" w:cs="Calibri" w:eastAsia="Calibri" w:hAnsi="Calibri"/>
-          <w:b/>
-          <w:bCs/>
-          <w:sz w:val="20"/>
-          <w:szCs w:val="20"/>
-        </w:rPr>
-        <w:t xml:space="preserve">It can't hold rigid output contracts.</w:t>
-      </w:r>
-      <w:r>
-        <w:rPr>
-          <w:rFonts w:ascii="Calibri" w:cs="Calibri" w:eastAsia="Calibri" w:hAnsi="Calibri"/>
-          <w:sz w:val="20"/>
-          <w:szCs w:val="20"/>
-        </w:rPr>
-        <w:t xml:space="preserve"> A strict JSON schema made it collapse (empty or truncated output) on 6 of 60 items.</w:t>
       </w:r>
     </w:p>
     <w:p>
@@ -813,7 +785,7 @@
     </w:p>
     <w:p>
       <w:pPr>
-        <w:spacing w:after="80" w:line="240"/>
+        <w:spacing w:after="50" w:line="234"/>
       </w:pPr>
       <w:r>
         <w:rPr>
@@ -831,7 +803,7 @@
           <w:ilvl w:val="0"/>
           <w:numId w:val="3"/>
         </w:numPr>
-        <w:spacing w:after="30" w:line="240"/>
+        <w:spacing w:after="15" w:line="234"/>
       </w:pPr>
       <w:r>
         <w:rPr>
@@ -877,7 +849,7 @@
           <w:ilvl w:val="0"/>
           <w:numId w:val="3"/>
         </w:numPr>
-        <w:spacing w:after="30" w:line="240"/>
+        <w:spacing w:after="15" w:line="234"/>
       </w:pPr>
       <w:r>
         <w:rPr>
@@ -895,7 +867,7 @@
           <w:sz w:val="20"/>
           <w:szCs w:val="20"/>
         </w:rPr>
-        <w:t xml:space="preserve"> in made-up names and fresh wording, chosen for the patterns it got wrong (</w:t>
+        <w:t xml:space="preserve"> in made-up names, chosen for the patterns it got wrong (</w:t>
       </w:r>
       <w:r>
         <w:rPr>
@@ -912,17 +884,17 @@
           <w:sz w:val="20"/>
           <w:szCs w:val="20"/>
         </w:rPr>
-        <w:t xml:space="preserve">, direction words, a station as the subject). Fresh wording because our system should be robust against a change in wording.</w:t>
-      </w:r>
-    </w:p>
-    <w:p>
-      <w:pPr>
-        <w:pStyle w:val="ListParagraph"/>
-        <w:numPr>
-          <w:ilvl w:val="0"/>
-          <w:numId w:val="3"/>
-        </w:numPr>
-        <w:spacing w:after="30" w:line="240"/>
+        <w:t xml:space="preserve">, direction words, a station as the subject). The biggest single component: without them 1× falls from 78 to 48–50, and a single example gives only 53.</w:t>
+      </w:r>
+    </w:p>
+    <w:p>
+      <w:pPr>
+        <w:pStyle w:val="ListParagraph"/>
+        <w:numPr>
+          <w:ilvl w:val="0"/>
+          <w:numId w:val="3"/>
+        </w:numPr>
+        <w:spacing w:after="15" w:line="234"/>
       </w:pPr>
       <w:r>
         <w:rPr>
@@ -1043,17 +1015,17 @@
           <w:sz w:val="20"/>
           <w:szCs w:val="20"/>
         </w:rPr>
-        <w:t xml:space="preserve">). Most direction flips were the model understanding the line and then filling the wrong slot; this makes it commit to the meaning first.</w:t>
-      </w:r>
-    </w:p>
-    <w:p>
-      <w:pPr>
-        <w:pStyle w:val="ListParagraph"/>
-        <w:numPr>
-          <w:ilvl w:val="0"/>
-          <w:numId w:val="3"/>
-        </w:numPr>
-        <w:spacing w:after="30" w:line="240"/>
+        <w:t xml:space="preserve">). Most direction flips were the model understanding the line and then filling the wrong slot; this makes it commit to the meaning first. Without it 1× drops to 63 and missed lines rise from ~40 to ~55 per run.</w:t>
+      </w:r>
+    </w:p>
+    <w:p>
+      <w:pPr>
+        <w:pStyle w:val="ListParagraph"/>
+        <w:numPr>
+          <w:ilvl w:val="0"/>
+          <w:numId w:val="3"/>
+        </w:numPr>
+        <w:spacing w:after="15" w:line="234"/>
       </w:pPr>
       <w:r>
         <w:rPr>
@@ -1071,25 +1043,38 @@
           <w:sz w:val="20"/>
           <w:szCs w:val="20"/>
         </w:rPr>
-        <w:t xml:space="preserve"> (code, no call): if a fact names someone its own line never mentions, swap in the one unused name the line does mention, else drop the fact. It fires about 10 times per run and is the biggest single gain at 1×: 71.7 → </w:t>
-      </w:r>
-      <w:r>
-        <w:rPr>
-          <w:rFonts w:ascii="Calibri" w:cs="Calibri" w:eastAsia="Calibri" w:hAnsi="Calibri"/>
-          <w:b/>
-          <w:bCs/>
-          <w:sz w:val="20"/>
-          <w:szCs w:val="20"/>
-        </w:rPr>
-        <w:t xml:space="preserve">80.0</w:t>
-      </w:r>
-      <w:r>
-        <w:rPr>
-          <w:rFonts w:ascii="Calibri" w:cs="Calibri" w:eastAsia="Calibri" w:hAnsi="Calibri"/>
-          <w:sz w:val="20"/>
-          <w:szCs w:val="20"/>
-        </w:rPr>
-        <w:t xml:space="preserve">.</w:t>
+        <w:t xml:space="preserve"> (code, no call): if a fact names someone its own line never mentions, swap in the one unused name the line does mention, else drop the fact. It fires about 10 times per run: +8 at 1× on the same model output (70 → 78), +4 at 3×, +7 at 10×.</w:t>
+      </w:r>
+    </w:p>
+    <w:p>
+      <w:pPr>
+        <w:spacing w:after="50" w:line="234"/>
+      </w:pPr>
+      <w:r>
+        <w:rPr>
+          <w:rFonts w:ascii="Calibri" w:cs="Calibri" w:eastAsia="Calibri" w:hAnsi="Calibri"/>
+          <w:sz w:val="20"/>
+          <w:szCs w:val="20"/>
+        </w:rPr>
+        <w:t xml:space="preserve">1× macro exact match: </w:t>
+      </w:r>
+      <w:r>
+        <w:rPr>
+          <w:rFonts w:ascii="Calibri" w:cs="Calibri" w:eastAsia="Calibri" w:hAnsi="Calibri"/>
+          <w:b/>
+          <w:bCs/>
+          <w:sz w:val="20"/>
+          <w:szCs w:val="20"/>
+        </w:rPr>
+        <w:t xml:space="preserve">79.7</w:t>
+      </w:r>
+      <w:r>
+        <w:rPr>
+          <w:rFonts w:ascii="Calibri" w:cs="Calibri" w:eastAsia="Calibri" w:hAnsi="Calibri"/>
+          <w:sz w:val="20"/>
+          <w:szCs w:val="20"/>
+        </w:rPr>
+        <w:t xml:space="preserve"> over 5 runs (70–85: a single read at temperature 1.0 is noisy).</w:t>
       </w:r>
     </w:p>
     <w:p>
@@ -1111,7 +1096,7 @@
     </w:p>
     <w:p>
       <w:pPr>
-        <w:spacing w:after="80" w:line="240"/>
+        <w:spacing w:after="50" w:line="234"/>
       </w:pPr>
       <w:r>
         <w:rPr>
@@ -1129,7 +1114,7 @@
           <w:ilvl w:val="0"/>
           <w:numId w:val="3"/>
         </w:numPr>
-        <w:spacing w:after="30" w:line="240"/>
+        <w:spacing w:after="15" w:line="234"/>
       </w:pPr>
       <w:r>
         <w:rPr>
@@ -1147,99 +1132,63 @@
           <w:sz w:val="20"/>
           <w:szCs w:val="20"/>
         </w:rPr>
-        <w:t xml:space="preserve"> that re-reads the lines where they disagree or a check fires: </w:t>
-      </w:r>
-      <w:r>
-        <w:rPr>
-          <w:rFonts w:ascii="Calibri" w:cs="Calibri" w:eastAsia="Calibri" w:hAnsi="Calibri"/>
-          <w:b/>
-          <w:bCs/>
-          <w:sz w:val="20"/>
-          <w:szCs w:val="20"/>
-        </w:rPr>
-        <w:t xml:space="preserve">81.1</w:t>
-      </w:r>
-      <w:r>
-        <w:rPr>
-          <w:rFonts w:ascii="Calibri" w:cs="Calibri" w:eastAsia="Calibri" w:hAnsi="Calibri"/>
-          <w:sz w:val="20"/>
-          <w:szCs w:val="20"/>
-        </w:rPr>
-        <w:t xml:space="preserve">, barely above 1×. The re-ask is one fresh sample that overwrites the line, so it turns right readings wrong about as often as it fixes them (12 wrong lines per run, against 5 for voting).</w:t>
-      </w:r>
-    </w:p>
-    <w:p>
-      <w:pPr>
-        <w:pStyle w:val="ListParagraph"/>
-        <w:numPr>
-          <w:ilvl w:val="0"/>
-          <w:numId w:val="3"/>
-        </w:numPr>
-        <w:spacing w:after="30" w:line="240"/>
-      </w:pPr>
-      <w:r>
-        <w:rPr>
-          <w:rFonts w:ascii="Calibri" w:cs="Calibri" w:eastAsia="Calibri" w:hAnsi="Calibri"/>
-          <w:b/>
-          <w:bCs/>
-          <w:sz w:val="20"/>
-          <w:szCs w:val="20"/>
-        </w:rPr>
-        <w:t xml:space="preserve">Three reads with the same prompt + per-line vote:</w:t>
-      </w:r>
-      <w:r>
-        <w:rPr>
-          <w:rFonts w:ascii="Calibri" w:cs="Calibri" w:eastAsia="Calibri" w:hAnsi="Calibri"/>
-          <w:sz w:val="20"/>
-          <w:szCs w:val="20"/>
-        </w:rPr>
-        <w:t xml:space="preserve"> little gain, because the reads share their mistakes.</w:t>
-      </w:r>
-    </w:p>
-    <w:p>
-      <w:pPr>
-        <w:pStyle w:val="ListParagraph"/>
-        <w:numPr>
-          <w:ilvl w:val="0"/>
-          <w:numId w:val="3"/>
-        </w:numPr>
-        <w:spacing w:after="30" w:line="240"/>
-      </w:pPr>
-      <w:r>
-        <w:rPr>
-          <w:rFonts w:ascii="Calibri" w:cs="Calibri" w:eastAsia="Calibri" w:hAnsi="Calibri"/>
-          <w:b/>
-          <w:bCs/>
-          <w:sz w:val="20"/>
-          <w:szCs w:val="20"/>
-        </w:rPr>
-        <w:t xml:space="preserve">Three reads with three differently formatted prompts + per-line vote: 83.9.</w:t>
-      </w:r>
-      <w:r>
-        <w:rPr>
-          <w:rFonts w:ascii="Calibri" w:cs="Calibri" w:eastAsia="Calibri" w:hAnsi="Calibri"/>
-          <w:sz w:val="20"/>
-          <w:szCs w:val="20"/>
-        </w:rPr>
-        <w:t xml:space="preserve"> Wrong lines fall from 22 to 5 per run. 3× never asks the model to fix itself; it fixes </w:t>
-      </w:r>
-      <w:r>
-        <w:rPr>
-          <w:rFonts w:ascii="Calibri" w:cs="Calibri" w:eastAsia="Calibri" w:hAnsi="Calibri"/>
-          <w:i/>
-          <w:iCs/>
-          <w:sz w:val="20"/>
-          <w:szCs w:val="20"/>
-        </w:rPr>
-        <w:t xml:space="preserve">random</w:t>
-      </w:r>
-      <w:r>
-        <w:rPr>
-          <w:rFonts w:ascii="Calibri" w:cs="Calibri" w:eastAsia="Calibri" w:hAnsi="Calibri"/>
-          <w:sz w:val="20"/>
-          <w:szCs w:val="20"/>
-        </w:rPr>
-        <w:t xml:space="preserve"> misreads by agreement, which is exactly what different prompts make possible.</w:t>
+        <w:t xml:space="preserve"> that re-reads the lines where they disagree or a check fires. It recovers more missed lines than voting (32 vs 41 per run) but makes more wrong ones (14 vs 10). It scored 85.0 vs 81.7 in one run and 81.1 vs 83.9 in an earlier 3-run comparison, so on this data neither wins.</w:t>
+      </w:r>
+    </w:p>
+    <w:p>
+      <w:pPr>
+        <w:pStyle w:val="ListParagraph"/>
+        <w:numPr>
+          <w:ilvl w:val="0"/>
+          <w:numId w:val="3"/>
+        </w:numPr>
+        <w:spacing w:after="15" w:line="234"/>
+      </w:pPr>
+      <w:r>
+        <w:rPr>
+          <w:rFonts w:ascii="Calibri" w:cs="Calibri" w:eastAsia="Calibri" w:hAnsi="Calibri"/>
+          <w:b/>
+          <w:bCs/>
+          <w:sz w:val="20"/>
+          <w:szCs w:val="20"/>
+        </w:rPr>
+        <w:t xml:space="preserve">Three reads with the same prompt + per-line vote: 80.0</w:t>
+      </w:r>
+      <w:r>
+        <w:rPr>
+          <w:rFonts w:ascii="Calibri" w:cs="Calibri" w:eastAsia="Calibri" w:hAnsi="Calibri"/>
+          <w:sz w:val="20"/>
+          <w:szCs w:val="20"/>
+        </w:rPr>
+        <w:t xml:space="preserve">, because the reads share their mistakes.</w:t>
+      </w:r>
+    </w:p>
+    <w:p>
+      <w:pPr>
+        <w:pStyle w:val="ListParagraph"/>
+        <w:numPr>
+          <w:ilvl w:val="0"/>
+          <w:numId w:val="3"/>
+        </w:numPr>
+        <w:spacing w:after="15" w:line="234"/>
+      </w:pPr>
+      <w:r>
+        <w:rPr>
+          <w:rFonts w:ascii="Calibri" w:cs="Calibri" w:eastAsia="Calibri" w:hAnsi="Calibri"/>
+          <w:b/>
+          <w:bCs/>
+          <w:sz w:val="20"/>
+          <w:szCs w:val="20"/>
+        </w:rPr>
+        <w:t xml:space="preserve">Three reads with three differently formatted prompts + per-line vote: 83.3</w:t>
+      </w:r>
+      <w:r>
+        <w:rPr>
+          <w:rFonts w:ascii="Calibri" w:cs="Calibri" w:eastAsia="Calibri" w:hAnsi="Calibri"/>
+          <w:sz w:val="20"/>
+          <w:szCs w:val="20"/>
+        </w:rPr>
+        <w:t xml:space="preserve"> (±2.6 over 5 runs, against ±6.2 at 1×); invented facts fall from 7 to 3 per run. I kept this one: it never lets a single fresh sample overwrite a reading, and 10× already re-asks flagged lines.</w:t>
       </w:r>
     </w:p>
     <w:p>
@@ -1261,7 +1210,7 @@
     </w:p>
     <w:p>
       <w:pPr>
-        <w:spacing w:after="80" w:line="240"/>
+        <w:spacing w:after="50" w:line="234"/>
       </w:pPr>
       <w:r>
         <w:rPr>
@@ -1386,15 +1335,15 @@
           <w:sz w:val="20"/>
           <w:szCs w:val="20"/>
         </w:rPr>
-        <w:t xml:space="preserve">88.3</w:t>
-      </w:r>
-      <w:r>
-        <w:rPr>
-          <w:rFonts w:ascii="Calibri" w:cs="Calibri" w:eastAsia="Calibri" w:hAnsi="Calibri"/>
-          <w:sz w:val="20"/>
-          <w:szCs w:val="20"/>
-        </w:rPr>
-        <w:t xml:space="preserve"> at 4.5 calls per item on average; 10 is a cap, not a target.</w:t>
+        <w:t xml:space="preserve">87.0</w:t>
+      </w:r>
+      <w:r>
+        <w:rPr>
+          <w:rFonts w:ascii="Calibri" w:cs="Calibri" w:eastAsia="Calibri" w:hAnsi="Calibri"/>
+          <w:sz w:val="20"/>
+          <w:szCs w:val="20"/>
+        </w:rPr>
+        <w:t xml:space="preserve"> (±1.4 over 5 runs) at 4.5 calls per item on average; 10 is a cap, not a target. The re-asks beat the vote in all 5 runs (+3.7 on average); once they exist, one read does as well as three (85.8 vs 85.8).</w:t>
       </w:r>
     </w:p>
     <w:p>
@@ -1421,7 +1370,7 @@
           <w:ilvl w:val="0"/>
           <w:numId w:val="3"/>
         </w:numPr>
-        <w:spacing w:after="30" w:line="240"/>
+        <w:spacing w:after="15" w:line="234"/>
       </w:pPr>
       <w:r>
         <w:rPr>
@@ -1439,7 +1388,7 @@
           <w:sz w:val="20"/>
           <w:szCs w:val="20"/>
         </w:rPr>
-        <w:t xml:space="preserve"> when two lines contradict on their own, apply the cheapest edit (flip an order, change a middle, flip a negation) that resolves it. +1.6 at 1×, inside run-to-run noise, and when it's wrong it is confidently wrong: on item B2-018 the real error was </w:t>
+        <w:t xml:space="preserve"> when two lines contradict on their own, apply the cheapest edit (flip an order, change a middle, flip a negation) that resolves it. +1.6 at 1× (measured before removal), inside run-to-run noise, and when it's wrong it is confidently wrong: on item B2-018 the real error was </w:t>
       </w:r>
       <w:r>
         <w:rPr>
@@ -1484,7 +1433,7 @@
           <w:ilvl w:val="0"/>
           <w:numId w:val="3"/>
         </w:numPr>
-        <w:spacing w:after="30" w:line="240"/>
+        <w:spacing w:after="15" w:line="234"/>
       </w:pPr>
       <w:r>
         <w:rPr>
@@ -1502,17 +1451,17 @@
           <w:sz w:val="20"/>
           <w:szCs w:val="20"/>
         </w:rPr>
-        <w:t xml:space="preserve"> fired less than once per run for +0.5. Removed for simplicity.</w:t>
-      </w:r>
-    </w:p>
-    <w:p>
-      <w:pPr>
-        <w:pStyle w:val="ListParagraph"/>
-        <w:numPr>
-          <w:ilvl w:val="0"/>
-          <w:numId w:val="3"/>
-        </w:numPr>
-        <w:spacing w:after="30" w:line="240"/>
+        <w:t xml:space="preserve"> fired less than once per run and changed no score. Removed.</w:t>
+      </w:r>
+    </w:p>
+    <w:p>
+      <w:pPr>
+        <w:pStyle w:val="ListParagraph"/>
+        <w:numPr>
+          <w:ilvl w:val="0"/>
+          <w:numId w:val="3"/>
+        </w:numPr>
+        <w:spacing w:after="15" w:line="234"/>
       </w:pPr>
       <w:r>
         <w:rPr>
@@ -1530,35 +1479,7 @@
           <w:sz w:val="20"/>
           <w:szCs w:val="20"/>
         </w:rPr>
-        <w:t xml:space="preserve"> collapsed on 6 of 60 items. Plain JSON mode kept.</w:t>
-      </w:r>
-    </w:p>
-    <w:p>
-      <w:pPr>
-        <w:pStyle w:val="ListParagraph"/>
-        <w:numPr>
-          <w:ilvl w:val="0"/>
-          <w:numId w:val="3"/>
-        </w:numPr>
-        <w:spacing w:after="30" w:line="240"/>
-      </w:pPr>
-      <w:r>
-        <w:rPr>
-          <w:rFonts w:ascii="Calibri" w:cs="Calibri" w:eastAsia="Calibri" w:hAnsi="Calibri"/>
-          <w:b/>
-          <w:bCs/>
-          <w:sz w:val="20"/>
-          <w:szCs w:val="20"/>
-        </w:rPr>
-        <w:t xml:space="preserve">Two reads + one fix call at 3×:</w:t>
-      </w:r>
-      <w:r>
-        <w:rPr>
-          <w:rFonts w:ascii="Calibri" w:cs="Calibri" w:eastAsia="Calibri" w:hAnsi="Calibri"/>
-          <w:sz w:val="20"/>
-          <w:szCs w:val="20"/>
-        </w:rPr>
-        <w:t xml:space="preserve"> beaten by voting (section 4).</w:t>
+        <w:t xml:space="preserve"> Granite can't hold a rigid output contract; it collapsed (empty or truncated output) on 6 of 60 items. Plain JSON mode kept.</w:t>
       </w:r>
     </w:p>
     <w:p>
@@ -1585,7 +1506,7 @@
           <w:ilvl w:val="0"/>
           <w:numId w:val="3"/>
         </w:numPr>
-        <w:spacing w:after="30" w:line="240"/>
+        <w:spacing w:after="15" w:line="234"/>
       </w:pPr>
       <w:r>
         <w:rPr>
@@ -1603,7 +1524,7 @@
           <w:sz w:val="20"/>
           <w:szCs w:val="20"/>
         </w:rPr>
-        <w:t xml:space="preserve"> At 10×: 26 missed lines per run against 4 wrong and 4 invented. Plain sentences get missed too (</w:t>
+        <w:t xml:space="preserve"> At 10×: 29 missed lines per run against 8 wrong and 3 invented. Plain sentences get missed too (</w:t>
       </w:r>
       <w:r>
         <w:rPr>
@@ -1665,7 +1586,7 @@
           <w:ilvl w:val="0"/>
           <w:numId w:val="3"/>
         </w:numPr>
-        <w:spacing w:after="30" w:line="240"/>
+        <w:spacing w:after="15" w:line="234"/>
       </w:pPr>
       <w:r>
         <w:rPr>
@@ -1729,7 +1650,7 @@
           <w:ilvl w:val="0"/>
           <w:numId w:val="3"/>
         </w:numPr>
-        <w:spacing w:after="30" w:line="240"/>
+        <w:spacing w:after="15" w:line="234"/>
       </w:pPr>
       <w:r>
         <w:rPr>
@@ -1792,7 +1713,7 @@
           <w:ilvl w:val="0"/>
           <w:numId w:val="3"/>
         </w:numPr>
-        <w:spacing w:after="30" w:line="240"/>
+        <w:spacing w:after="15" w:line="234"/>
       </w:pPr>
       <w:r>
         <w:rPr>
@@ -1810,17 +1731,17 @@
           <w:sz w:val="20"/>
           <w:szCs w:val="20"/>
         </w:rPr>
-        <w:t xml:space="preserve"> (0.83 at 10×): it needs every constraint, and a single miss adds a solution.</w:t>
-      </w:r>
-    </w:p>
-    <w:p>
-      <w:pPr>
-        <w:pStyle w:val="ListParagraph"/>
-        <w:numPr>
-          <w:ilvl w:val="0"/>
-          <w:numId w:val="3"/>
-        </w:numPr>
-        <w:spacing w:after="30" w:line="240"/>
+        <w:t xml:space="preserve"> (80% at 10×, against 92% unique and 89% inconsistent): it needs every constraint, and a single miss adds a solution.</w:t>
+      </w:r>
+    </w:p>
+    <w:p>
+      <w:pPr>
+        <w:pStyle w:val="ListParagraph"/>
+        <w:numPr>
+          <w:ilvl w:val="0"/>
+          <w:numId w:val="3"/>
+        </w:numPr>
+        <w:spacing w:after="15" w:line="234"/>
       </w:pPr>
       <w:r>
         <w:rPr>
@@ -1838,7 +1759,7 @@
           <w:sz w:val="20"/>
           <w:szCs w:val="20"/>
         </w:rPr>
-        <w:t xml:space="preserve"> I tuned on these 60 items. The examples avoid their wording, but the hints were written from errors I saw here.</w:t>
+        <w:t xml:space="preserve"> I tuned on these 60 items: the examples use made-up names, but they and the hints were written from errors I saw here.</w:t>
       </w:r>
     </w:p>
     <w:p>
@@ -1860,7 +1781,7 @@
     </w:p>
     <w:p>
       <w:pPr>
-        <w:spacing w:after="80" w:line="240"/>
+        <w:spacing w:after="50" w:line="234"/>
       </w:pPr>
       <w:r>
         <w:rPr>
@@ -1896,7 +1817,7 @@
           <w:ilvl w:val="0"/>
           <w:numId w:val="3"/>
         </w:numPr>
-        <w:spacing w:after="30" w:line="240"/>
+        <w:spacing w:after="15" w:line="234"/>
       </w:pPr>
       <w:r>
         <w:rPr>
@@ -1960,7 +1881,7 @@
           <w:ilvl w:val="0"/>
           <w:numId w:val="3"/>
         </w:numPr>
-        <w:spacing w:after="30" w:line="240"/>
+        <w:spacing w:after="15" w:line="234"/>
       </w:pPr>
       <w:r>
         <w:rPr>
@@ -2024,7 +1945,7 @@
           <w:ilvl w:val="0"/>
           <w:numId w:val="3"/>
         </w:numPr>
-        <w:spacing w:after="30" w:line="240"/>
+        <w:spacing w:after="15" w:line="234"/>
       </w:pPr>
       <w:r>
         <w:rPr>
@@ -2069,7 +1990,7 @@
           <w:ilvl w:val="0"/>
           <w:numId w:val="3"/>
         </w:numPr>
-        <w:spacing w:after="30" w:line="240"/>
+        <w:spacing w:after="15" w:line="234"/>
       </w:pPr>
       <w:r>
         <w:rPr>
@@ -2087,96 +2008,124 @@
           <w:sz w:val="20"/>
           <w:szCs w:val="20"/>
         </w:rPr>
-        <w:t xml:space="preserve"> Much of this was written with Claude in a few hours; I'd want each piece understood and earning its place, not just passing the ablation.</w:t>
-      </w:r>
-    </w:p>
-    <w:p>
-      <w:pPr>
-        <w:pStyle w:val="ListParagraph"/>
-        <w:numPr>
-          <w:ilvl w:val="0"/>
-          <w:numId w:val="3"/>
-        </w:numPr>
-        <w:spacing w:after="30" w:line="240"/>
-      </w:pPr>
-      <w:r>
-        <w:rPr>
-          <w:rFonts w:ascii="Calibri" w:cs="Calibri" w:eastAsia="Calibri" w:hAnsi="Calibri"/>
-          <w:b/>
-          <w:bCs/>
-          <w:sz w:val="20"/>
-          <w:szCs w:val="20"/>
-        </w:rPr>
-        <w:t xml:space="preserve">Study the misses properly.</w:t>
-      </w:r>
-      <w:r>
-        <w:rPr>
-          <w:rFonts w:ascii="Calibri" w:cs="Calibri" w:eastAsia="Calibri" w:hAnsi="Calibri"/>
-          <w:sz w:val="20"/>
-          <w:szCs w:val="20"/>
-        </w:rPr>
-        <w:t xml:space="preserve"> Label every missed line by surface form (hedge, restatement prefix, sentence shape, relation) and test whether misses come from attention (one line per call would tell) or from the model treating a hedge as "unsure".</w:t>
-      </w:r>
-    </w:p>
-    <w:p>
-      <w:pPr>
-        <w:pStyle w:val="ListParagraph"/>
-        <w:numPr>
-          <w:ilvl w:val="0"/>
-          <w:numId w:val="3"/>
-        </w:numPr>
-        <w:spacing w:after="30" w:line="240"/>
-      </w:pPr>
-      <w:r>
-        <w:rPr>
-          <w:rFonts w:ascii="Calibri" w:cs="Calibri" w:eastAsia="Calibri" w:hAnsi="Calibri"/>
-          <w:b/>
-          <w:bCs/>
-          <w:sz w:val="20"/>
-          <w:szCs w:val="20"/>
-        </w:rPr>
-        <w:t xml:space="preserve">A softer solver.</w:t>
-      </w:r>
-      <w:r>
-        <w:rPr>
-          <w:rFonts w:ascii="Calibri" w:cs="Calibri" w:eastAsia="Calibri" w:hAnsi="Calibri"/>
-          <w:sz w:val="20"/>
-          <w:szCs w:val="20"/>
-        </w:rPr>
-        <w:t xml:space="preserve"> Today one wrong fact makes the notes inconsistent. With a confidence per fact (vote share, or token log-probabilities if the endpoint exposes them), the solver could pick the most likely consistent rota and only declare inconsistent when the conflict survives dropping low-confidence facts.</w:t>
-      </w:r>
-    </w:p>
-    <w:p>
-      <w:pPr>
-        <w:pStyle w:val="ListParagraph"/>
-        <w:numPr>
-          <w:ilvl w:val="0"/>
-          <w:numId w:val="3"/>
-        </w:numPr>
-        <w:spacing w:after="30" w:line="240"/>
-      </w:pPr>
-      <w:r>
-        <w:rPr>
-          <w:rFonts w:ascii="Calibri" w:cs="Calibri" w:eastAsia="Calibri" w:hAnsi="Calibri"/>
-          <w:b/>
-          <w:bCs/>
-          <w:sz w:val="20"/>
-          <w:szCs w:val="20"/>
-        </w:rPr>
-        <w:t xml:space="preserve">Test on notes written by people,</w:t>
-      </w:r>
-      <w:r>
-        <w:rPr>
-          <w:rFonts w:ascii="Calibri" w:cs="Calibri" w:eastAsia="Calibri" w:hAnsi="Calibri"/>
-          <w:sz w:val="20"/>
-          <w:szCs w:val="20"/>
-        </w:rPr>
-        <w:t xml:space="preserve"> even 20 of them, before trusting any of the above.</w:t>
+        <w:t xml:space="preserve"> Much of this was written with Claude in a few hours; each piece should be understood, not just pass the ablation.</w:t>
+      </w:r>
+    </w:p>
+    <w:p>
+      <w:pPr>
+        <w:pStyle w:val="ListParagraph"/>
+        <w:numPr>
+          <w:ilvl w:val="0"/>
+          <w:numId w:val="3"/>
+        </w:numPr>
+        <w:spacing w:after="15" w:line="234"/>
+      </w:pPr>
+      <w:r>
+        <w:rPr>
+          <w:rFonts w:ascii="Calibri" w:cs="Calibri" w:eastAsia="Calibri" w:hAnsi="Calibri"/>
+          <w:b/>
+          <w:bCs/>
+          <w:sz w:val="20"/>
+          <w:szCs w:val="20"/>
+        </w:rPr>
+        <w:t xml:space="preserve">A solver that scales, and a softer one.</w:t>
+      </w:r>
+      <w:r>
+        <w:rPr>
+          <w:rFonts w:ascii="Calibri" w:cs="Calibri" w:eastAsia="Calibri" w:hAnsi="Calibri"/>
+          <w:sz w:val="20"/>
+          <w:szCs w:val="20"/>
+        </w:rPr>
+        <w:t xml:space="preserve"> Brute force works only because there are 720 rotas; 10 people and 10 blocks is ~3.6M orders. I'd move the same facts into a constraint solver (OR-Tools CP-SAT or Z3): count solutions up to 5, and take the conflict set from the unsatisfiable core, shrunk to minimal. Extraction would not change. With a confidence per fact (vote share or log-probabilities), a weighted version (MaxSAT) could also stop one wrong fact from making the notes inconsistent.</w:t>
+      </w:r>
+    </w:p>
+    <w:p>
+      <w:pPr>
+        <w:pStyle w:val="ListParagraph"/>
+        <w:numPr>
+          <w:ilvl w:val="0"/>
+          <w:numId w:val="3"/>
+        </w:numPr>
+        <w:spacing w:after="15" w:line="234"/>
+      </w:pPr>
+      <w:r>
+        <w:rPr>
+          <w:rFonts w:ascii="Calibri" w:cs="Calibri" w:eastAsia="Calibri" w:hAnsi="Calibri"/>
+          <w:b/>
+          <w:bCs/>
+          <w:sz w:val="20"/>
+          <w:szCs w:val="20"/>
+        </w:rPr>
+        <w:t xml:space="preserve">Understand 10× before adding to it.</w:t>
+      </w:r>
+      <w:r>
+        <w:rPr>
+          <w:rFonts w:ascii="Calibri" w:cs="Calibri" w:eastAsia="Calibri" w:hAnsi="Calibri"/>
+          <w:sz w:val="20"/>
+          <w:szCs w:val="20"/>
+        </w:rPr>
+        <w:t xml:space="preserve"> It is a vote plus five kinds of re-ask, and the data cannot yet say which re-ask earns its call. I'd ablate each with enough runs, then move calls to where the errors are (29 missed lines per run vs 11 wrong or invented): re-read lines voted "none" that still name two people, and stop early on items whose reads agree.</w:t>
+      </w:r>
+    </w:p>
+    <w:p>
+      <w:pPr>
+        <w:pStyle w:val="ListParagraph"/>
+        <w:numPr>
+          <w:ilvl w:val="0"/>
+          <w:numId w:val="3"/>
+        </w:numPr>
+        <w:spacing w:after="15" w:line="234"/>
+      </w:pPr>
+      <w:r>
+        <w:rPr>
+          <w:rFonts w:ascii="Calibri" w:cs="Calibri" w:eastAsia="Calibri" w:hAnsi="Calibri"/>
+          <w:b/>
+          <w:bCs/>
+          <w:sz w:val="20"/>
+          <w:szCs w:val="20"/>
+        </w:rPr>
+        <w:t xml:space="preserve">Entity resolution as its own step:</w:t>
+      </w:r>
+      <w:r>
+        <w:rPr>
+          <w:rFonts w:ascii="Calibri" w:cs="Calibri" w:eastAsia="Calibri" w:hAnsi="Calibri"/>
+          <w:sz w:val="20"/>
+          <w:szCs w:val="20"/>
+        </w:rPr>
+        <w:t xml:space="preserve"> map every mention ("she", "the new starter", "whoever runs intake", nicknames, typos) to a header name before extraction, so the wrong-name repair works on any wording.</w:t>
+      </w:r>
+    </w:p>
+    <w:p>
+      <w:pPr>
+        <w:pStyle w:val="ListParagraph"/>
+        <w:numPr>
+          <w:ilvl w:val="0"/>
+          <w:numId w:val="3"/>
+        </w:numPr>
+        <w:spacing w:after="15" w:line="234"/>
+      </w:pPr>
+      <w:r>
+        <w:rPr>
+          <w:rFonts w:ascii="Calibri" w:cs="Calibri" w:eastAsia="Calibri" w:hAnsi="Calibri"/>
+          <w:b/>
+          <w:bCs/>
+          <w:sz w:val="20"/>
+          <w:szCs w:val="20"/>
+        </w:rPr>
+        <w:t xml:space="preserve">Less noise, real notes:</w:t>
+      </w:r>
+      <w:r>
+        <w:rPr>
+          <w:rFonts w:ascii="Calibri" w:cs="Calibri" w:eastAsia="Calibri" w:hAnsi="Calibri"/>
+          <w:sz w:val="20"/>
+          <w:szCs w:val="20"/>
+        </w:rPr>
+        <w:t xml:space="preserve"> 5+ runs per component (most here have 1–2, and the 3× choice is unsettled), and a test on even 20 notes written by people.</w:t>
       </w:r>
     </w:p>
     <w:sectPr>
       <w:pgSz w:w="12240" w:h="15840" w:orient="portrait"/>
-      <w:pgMar w:top="800" w:right="950" w:bottom="800" w:left="950" w:header="708" w:footer="708" w:gutter="0"/>
+      <w:pgMar w:top="700" w:right="900" w:bottom="700" w:left="900" w:header="708" w:footer="708" w:gutter="0"/>
       <w:pgNumType/>
       <w:docGrid w:linePitch="360"/>
     </w:sectPr>

</xml_diff>